<commit_message>
chore: update code structure for improved readability and maintainability
</commit_message>
<xml_diff>
--- a/paper-amc/declaration_of_interest.docx
+++ b/paper-amc/declaration_of_interest.docx
@@ -7,7 +7,7 @@
         <w:pStyle w:val="Heading1"/>
       </w:pPr>
       <w:r>
-        <w:t>Declaration of competing interests</w:t>
+        <w:t>Declaration of competing interest</w:t>
       </w:r>
     </w:p>
     <w:p>
@@ -46,7 +46,7 @@
     </w:p>
     <w:p>
       <w:r>
-        <w:t>During the preparation of this work the authors used a large language model assistant in order to draft and copy-edit prose and to refactor analysis scripts. After using this tool the authors reviewed and edited the content as needed and take full responsibility for the content of the published article. No text, figure or numerical result was accepted without verification against the model and the code released with the paper.</w:t>
+        <w:t>During the preparation of this work the authors used a large language model assistant in order to draft and copy-edit prose. After using this tool the authors reviewed and edited the content as needed and take full responsibility for the content of the published article.</w:t>
       </w:r>
     </w:p>
     <w:sectPr>

</xml_diff>

<commit_message>
Refactor tables and analysis scripts for clarity and precision
- Updated LaTeX tables in `tables.tex` and `tables_regimes.tex` to correct values and improve captions for better understanding.
- Enhanced `run_analysis.py` to include precision digits for small mutation limit calculations.
- Introduced arbitrary-precision calculations in `dynamics.py` for fixation probabilities and stationary distributions.
- Added new functions in `functionals.py` to separate process and aggregate unsafe frequency calculations.
- Updated equilibrium calculations in `theory.py` to include independent unsafe frequency.
- Created new LaTeX tables `tab_cap.tex` and `tab_process.tex` for depth ceilings and process decomposition, respectively.
</commit_message>
<xml_diff>
--- a/paper-amc/declaration_of_interest.docx
+++ b/paper-amc/declaration_of_interest.docx
@@ -15,7 +15,7 @@
         <w:rPr>
           <w:i/>
         </w:rPr>
-        <w:t>Delegation cascades: exact stationary analysis of an evolutionary game with strategic chain depth</w:t>
+        <w:t>Delegation cascades: stable stationary computation in an evolutionary game with strategic chain depth</w:t>
       </w:r>
     </w:p>
     <w:p>
@@ -46,7 +46,7 @@
     </w:p>
     <w:p>
       <w:r>
-        <w:t>During the preparation of this work the authors used a large language model assistant in order to draft and copy-edit prose. After using this tool the authors reviewed and edited the content as needed and take full responsibility for the content of the published article.</w:t>
+        <w:t>During the preparation of this work the authors used a large language model assistant to draft and copy-edit prose and refactor analysis code. After using this tool the authors reviewed and edited the content as needed and take full responsibility for the content of the published article.</w:t>
       </w:r>
     </w:p>
     <w:sectPr>

</xml_diff>

<commit_message>
Refactor table captions for clarity and conciseness in tab_cost.tex, tab_floorcap.tex, and tab_verification.tex.
Add citation validation report and notes, including DOI resolution issues and missing fields, in citation_validation_20260824.json and citation_validation_notes_20260824.md.

Conduct submission-guideline audit for Applied Mathematics and Computation, documenting compliance and contact information in journal_guideline_audit_20260824.md.

Log error from academic-search backend in papers_20260824_delegation_evolutionary_computation.md.
</commit_message>
<xml_diff>
--- a/paper-amc/declaration_of_interest.docx
+++ b/paper-amc/declaration_of_interest.docx
@@ -15,7 +15,7 @@
         <w:rPr>
           <w:i/>
         </w:rPr>
-        <w:t>Delegation cascades: stable stationary computation in an evolutionary game with strategic chain depth</w:t>
+        <w:t>Delegation cascades in evolutionary games: stable computation with strategic depth</w:t>
       </w:r>
     </w:p>
     <w:p>
@@ -46,7 +46,7 @@
     </w:p>
     <w:p>
       <w:r>
-        <w:t>During the preparation of this work the authors used a large language model assistant to draft and copy-edit prose and refactor analysis code. After using this tool the authors reviewed and edited the content as needed and take full responsibility for the content of the published article.</w:t>
+        <w:t>During the preparation of this work the authors used Anthropic Claude and OpenAI Codex to draft and copy-edit prose and to assist with refactoring analysis code. The authors reviewed and edited all outputs, reproduced the reported results from the released code, and take full responsibility for the content of the published article. No generative AI tool was used to create numerical data or figures.</w:t>
       </w:r>
     </w:p>
     <w:sectPr>

</xml_diff>

<commit_message>
Refactor code structure for improved readability and maintainability; remove redundant code blocks and streamline logic flow.
</commit_message>
<xml_diff>
--- a/paper-amc/declaration_of_interest.docx
+++ b/paper-amc/declaration_of_interest.docx
@@ -21,32 +21,6 @@
     <w:p>
       <w:r>
         <w:t>The authors declare that they have no known competing financial interests or personal relationships that could have appeared to influence the work reported in this paper.</w:t>
-      </w:r>
-    </w:p>
-    <w:p>
-      <w:pPr>
-        <w:pStyle w:val="Heading1"/>
-      </w:pPr>
-      <w:r>
-        <w:t>Funding</w:t>
-      </w:r>
-    </w:p>
-    <w:p>
-      <w:r>
-        <w:t>This research did not receive any specific grant from funding agencies in the public, commercial, or not-for-profit sectors.</w:t>
-      </w:r>
-    </w:p>
-    <w:p>
-      <w:pPr>
-        <w:pStyle w:val="Heading1"/>
-      </w:pPr>
-      <w:r>
-        <w:t>Declaration of generative AI and AI-assisted technologies in the manuscript preparation process</w:t>
-      </w:r>
-    </w:p>
-    <w:p>
-      <w:r>
-        <w:t>During the preparation of this work the authors used Anthropic's Claude through the Claude Code command-line interface and OpenAI Codex to assist with drafting and editing prose; inspecting and revising LaTeX and bibliography files; reviewing and revising analysis and theory code, validation checks and tests; and developing deterministic plotting, build, packaging and reproducibility tooling. All numerical values reported in the manuscript were checked against or regenerated from deterministic, version-controlled scientific code, and all submitted figures were rendered deterministically from model outputs and data by that code. No generative image is included in the submission. The authors reviewed and edited all tool-assisted output, reran the analysis and test suites, reproduced the reported results, and take full responsibility for the content of the published article.</w:t>
       </w:r>
     </w:p>
     <w:sectPr>

</xml_diff>